<commit_message>
Korespondenční adresa: form checkbox + field, Odoo field in Smlouva o dílo tab, line in contract and dodatek
Co-Authored-By: Claude Opus 5.5 <noreply@anthropic.com>
</commit_message>
<xml_diff>
--- a/Dodatek-LUNASTAV-vzor.docx
+++ b/Dodatek-LUNASTAV-vzor.docx
@@ -337,6 +337,23 @@
       <w:r>
         <w:t>}</w:t>
       </w:r>
+    </w:p>
+    <w:p>
+      <w:pPr>
+        <w:spacing w:after="0"/>
+      </w:pPr>
+      <w:r>
+        <w:t xml:space="preserve">Korespondenční adresa: </w:t>
+      </w:r>
+      <w:r>
+        <w:t>{korespondencniAdresa}</w:t>
+      </w:r>
+      <w:proofErr w:type="spellStart"/>
+      <w:proofErr w:type="spellEnd"/>
+      <w:proofErr w:type="spellStart"/>
+      <w:proofErr w:type="spellEnd"/>
+      <w:proofErr w:type="spellStart"/>
+      <w:proofErr w:type="spellEnd"/>
     </w:p>
     <w:p>
       <w:pPr>

</xml_diff>

<commit_message>
Validate date of birth before preview (00.00.0000 crashed confirm); LUNASTAV korespondenční adresa in contract and dodatek
Co-Authored-By: Claude Opus 5.5 <noreply@anthropic.com>
</commit_message>
<xml_diff>
--- a/Dodatek-LUNASTAV-vzor.docx
+++ b/Dodatek-LUNASTAV-vzor.docx
@@ -456,6 +456,14 @@
       </w:pPr>
       <w:r>
         <w:t>se sídlem Ostrovní 2059/4, 110 00 Praha 1</w:t>
+      </w:r>
+    </w:p>
+    <w:p>
+      <w:pPr>
+        <w:spacing w:after="0"/>
+      </w:pPr>
+      <w:r>
+        <w:t>Korespondenční adresa: Gočárova třída 227/50, 500 02 Hradec Králové</w:t>
       </w:r>
     </w:p>
     <w:p>

</xml_diff>